<commit_message>
Bump backend overview app to v0.39.32
Co-authored-by: Copilot <223556219+Copilot@users.noreply.github.com>
</commit_message>
<xml_diff>
--- a/USER_GUIDE.docx
+++ b/USER_GUIDE.docx
@@ -1,5 +1,43 @@
 
-<file path=word/document.xml><?xml version="1.0" encoding="utf-8"?>
+<file path=docProps\app.xml><?xml version="1.0" encoding="utf-8"?>
+<Properties xmlns="http://schemas.openxmlformats.org/officeDocument/2006/extended-properties" xmlns:vt="http://schemas.openxmlformats.org/officeDocument/2006/docPropsVTypes">
+  <Words>83</Words>
+  <SharedDoc>false</SharedDoc>
+  <HyperlinksChanged>false</HyperlinksChanged>
+  <Lines>12</Lines>
+  <AppVersion>12.0000</AppVersion>
+  <LinksUpToDate>false</LinksUpToDate>
+  <Application>Microsoft Word 12.0.0</Application>
+  <CharactersWithSpaces>583</CharactersWithSpaces>
+  <Template>Normal.dotm</Template>
+  <DocSecurity>0</DocSecurity>
+  <TotalTime>6</TotalTime>
+  <ScaleCrop>false</ScaleCrop>
+  <Characters>475</Characters>
+  <Paragraphs>8</Paragraphs>
+  <Pages>1</Pages>
+</Properties>
+</file>
+
+<file path=docProps\core.xml><?xml version="1.0" encoding="utf-8"?>
+<cp:coreProperties xmlns:cp="http://schemas.openxmlformats.org/package/2006/metadata/core-properties" xmlns:dc="http://purl.org/dc/elements/1.1/" xmlns:dcterms="http://purl.org/dc/terms/" xmlns:dcmitype="http://purl.org/dc/dcmitype/" xmlns:xsi="http://www.w3.org/2001/XMLSchema-instance">
+  <dc:title/>
+  <dc:creator/>
+  <cp:keywords/>
+  <dcterms:created xsi:type="dcterms:W3CDTF">2026-08-10T23:54:10Z</dcterms:created>
+  <dcterms:modified xsi:type="dcterms:W3CDTF">2026-08-10T23:54:10Z</dcterms:modified>
+</cp:coreProperties>
+</file>
+
+<file path=docProps\custom.xml><?xml version="1.0" encoding="utf-8"?>
+<Properties xmlns="http://schemas.openxmlformats.org/officeDocument/2006/custom-properties" xmlns:vt="http://schemas.openxmlformats.org/officeDocument/2006/docPropsVTypes"/>
+</file>
+
+<file path=word\comments.xml><?xml version="1.0" encoding="utf-8"?>
+<w:comments xmlns:w="http://schemas.openxmlformats.org/wordprocessingml/2006/main" xmlns:m="http://schemas.openxmlformats.org/officeDocument/2006/math" xmlns:r="http://schemas.openxmlformats.org/officeDocument/2006/relationships" xmlns:o="urn:schemas-microsoft-com:office:office" xmlns:v="urn:schemas-microsoft-com:vml" xmlns:w10="urn:schemas-microsoft-com:office:word" xmlns:a="http://schemas.openxmlformats.org/drawingml/2006/main" xmlns:pic="http://schemas.openxmlformats.org/drawingml/2006/picture" xmlns:wp="http://schemas.openxmlformats.org/drawingml/2006/wordprocessingDrawing"/>
+</file>
+
+<file path=word\document.xml><?xml version="1.0" encoding="utf-8"?>
 <w:document xmlns:w="http://schemas.openxmlformats.org/wordprocessingml/2006/main" xmlns:m="http://schemas.openxmlformats.org/officeDocument/2006/math" xmlns:r="http://schemas.openxmlformats.org/officeDocument/2006/relationships" xmlns:o="urn:schemas-microsoft-com:office:office" xmlns:v="urn:schemas-microsoft-com:vml" xmlns:w10="urn:schemas-microsoft-com:office:word" xmlns:a="http://schemas.openxmlformats.org/drawingml/2006/main" xmlns:pic="http://schemas.openxmlformats.org/drawingml/2006/picture" xmlns:wp="http://schemas.openxmlformats.org/drawingml/2006/wordprocessingDrawing">
   <w:body>
     <w:bookmarkStart w:id="90" w:name="services-overview-app-user-guide"/>
@@ -8,7 +46,7 @@
         <w:pStyle w:val="Heading1"/>
       </w:pPr>
       <w:r>
-        <w:t xml:space="preserve">Services Overview App — User Guide</w:t>
+        <w:t xml:space="preserve">Backend Overview App — User Guide</w:t>
       </w:r>
     </w:p>
     <w:p>
@@ -448,7 +486,7 @@
           <w:b/>
           <w:bCs/>
         </w:rPr>
-        <w:t xml:space="preserve">Services Overview App</w:t>
+        <w:t xml:space="preserve">Backend Overview App</w:t>
       </w:r>
       <w:r>
         <w:t xml:space="preserve"> </w:t>
@@ -9576,11 +9614,61 @@
 </w:document>
 </file>
 
-<file path=word/comments.xml><?xml version="1.0" encoding="utf-8"?>
-<w:comments xmlns:w="http://schemas.openxmlformats.org/wordprocessingml/2006/main" xmlns:m="http://schemas.openxmlformats.org/officeDocument/2006/math" xmlns:r="http://schemas.openxmlformats.org/officeDocument/2006/relationships" xmlns:o="urn:schemas-microsoft-com:office:office" xmlns:v="urn:schemas-microsoft-com:vml" xmlns:w10="urn:schemas-microsoft-com:office:word" xmlns:a="http://schemas.openxmlformats.org/drawingml/2006/main" xmlns:pic="http://schemas.openxmlformats.org/drawingml/2006/picture" xmlns:wp="http://schemas.openxmlformats.org/drawingml/2006/wordprocessingDrawing"/>
+<file path=word\fontTable.xml><?xml version="1.0" encoding="utf-8"?>
+<w:fonts xmlns:r="http://schemas.openxmlformats.org/officeDocument/2006/relationships" xmlns:w="http://schemas.openxmlformats.org/wordprocessingml/2006/main">
+  <w:font w:name="Aptos">
+    <w:panose1 w:val="020B0004020202020204"/>
+    <w:charset w:val="00"/>
+    <w:family w:val="swiss"/>
+    <w:pitch w:val="variable"/>
+    <w:sig w:usb0="20000287" w:usb1="00000003" w:usb2="00000000" w:usb3="00000000" w:csb0="0000019F" w:csb1="00000000"/>
+  </w:font>
+  <w:font w:name="Times New Roman">
+    <w:panose1 w:val="02020603050405020304"/>
+    <w:charset w:val="00"/>
+    <w:family w:val="roman"/>
+    <w:pitch w:val="variable"/>
+    <w:sig w:usb0="E0002EFF" w:usb1="C000785B" w:usb2="00000009" w:usb3="00000000" w:csb0="000001FF" w:csb1="00000000"/>
+  </w:font>
+  <w:font w:name="Aptos Display">
+    <w:panose1 w:val="020B0004020202020204"/>
+    <w:charset w:val="00"/>
+    <w:family w:val="swiss"/>
+    <w:pitch w:val="variable"/>
+    <w:sig w:usb0="20000287" w:usb1="00000003" w:usb2="00000000" w:usb3="00000000" w:csb0="0000019F" w:csb1="00000000"/>
+  </w:font>
+  <w:font w:name="Cambria Math">
+    <w:panose1 w:val="02040503050406030204"/>
+    <w:charset w:val="00"/>
+    <w:family w:val="roman"/>
+    <w:pitch w:val="variable"/>
+    <w:sig w:usb0="E00002FF" w:usb1="420024FF" w:usb2="00000000" w:usb3="00000000" w:csb0="0000019F" w:csb1="00000000"/>
+  </w:font>
+  <w:font w:name="Courier New">
+    <w:panose1 w:val="02070309020205020404"/>
+    <w:charset w:val="00"/>
+    <w:family w:val="modern"/>
+    <w:pitch w:val="fixed"/>
+    <w:sig w:usb0="E0002AFF" w:usb1="C0007843" w:usb2="00000009" w:usb3="00000000" w:csb0="000001FF" w:csb1="00000000"/>
+  </w:font>
+  <w:font w:name="Cambria">
+    <w:panose1 w:val="02040503050406030204"/>
+    <w:charset w:val="00"/>
+    <w:family w:val="roman"/>
+    <w:pitch w:val="variable"/>
+    <w:sig w:usb0="E00002FF" w:usb1="400004FF" w:usb2="00000000" w:usb3="00000000" w:csb0="0000019F" w:csb1="00000000"/>
+  </w:font>
+  <w:font w:name="Calibri">
+    <w:panose1 w:val="020F0502020204030204"/>
+    <w:charset w:val="00"/>
+    <w:family w:val="swiss"/>
+    <w:pitch w:val="variable"/>
+    <w:sig w:usb0="E0002AFF" w:usb1="C000247B" w:usb2="00000009" w:usb3="00000000" w:csb0="000001FF" w:csb1="00000000"/>
+  </w:font>
+</w:fonts>
 </file>
 
-<file path=word/footnotes.xml><?xml version="1.0" encoding="utf-8"?>
+<file path=word\footnotes.xml><?xml version="1.0" encoding="utf-8"?>
 <w:footnotes xmlns:w="http://schemas.openxmlformats.org/wordprocessingml/2006/main" xmlns:m="http://schemas.openxmlformats.org/officeDocument/2006/math" xmlns:r="http://schemas.openxmlformats.org/officeDocument/2006/relationships" xmlns:o="urn:schemas-microsoft-com:office:office" xmlns:v="urn:schemas-microsoft-com:vml" xmlns:w10="urn:schemas-microsoft-com:office:word" xmlns:a="http://schemas.openxmlformats.org/drawingml/2006/main" xmlns:pic="http://schemas.openxmlformats.org/drawingml/2006/picture" xmlns:wp="http://schemas.openxmlformats.org/drawingml/2006/wordprocessingDrawing">
   <w:footnote w:type="continuationSeparator" w:id="0">
     <w:p>
@@ -9599,7 +9687,7 @@
 </w:footnotes>
 </file>
 
-<file path=word/numbering.xml><?xml version="1.0" encoding="utf-8"?>
+<file path=word\numbering.xml><?xml version="1.0" encoding="utf-8"?>
 <w:numbering xmlns:w="http://schemas.openxmlformats.org/wordprocessingml/2006/main">
   <w:abstractNum w:abstractNumId="990">
     <w:nsid w:val="0000A990"/>
@@ -10276,7 +10364,30 @@
 </w:numbering>
 </file>
 
-<file path=word/styles.xml><?xml version="1.0" encoding="utf-8"?>
+<file path=word\settings.xml><?xml version="1.0" encoding="utf-8"?>
+<w:settings xmlns:m="http://schemas.openxmlformats.org/officeDocument/2006/math" xmlns:o="urn:schemas-microsoft-com:office:office" xmlns:r="http://schemas.openxmlformats.org/officeDocument/2006/relationships" xmlns:sl="http://schemas.openxmlformats.org/schemaLibrary/2006/main" xmlns:v="urn:schemas-microsoft-com:vml" xmlns:w="http://schemas.openxmlformats.org/wordprocessingml/2006/main" xmlns:w10="urn:schemas-microsoft-com:office:word">
+  <w:zoom w:percent="100"/>
+  <w:embedSystemFonts/>
+  <w:proofState w:grammar="clean" w:spelling="clean"/>
+  <w:stylePaneFormatFilter w:val="0004"/>
+  <w:doNotTrackMoves/>
+  <w:defaultTabStop w:val="720"/>
+  <w:drawingGridHorizontalSpacing w:val="360"/>
+  <w:drawingGridVerticalSpacing w:val="360"/>
+  <w:displayHorizontalDrawingGridEvery w:val="0"/>
+  <w:displayVerticalDrawingGridEvery w:val="0"/>
+  <w:characterSpacingControl w:val="doNotCompress"/>
+  <w:savePreviewPicture/>
+  <w:rsids>
+  </w:rsids>
+  <w:themeFontLang w:val="en-US"/>
+  <w:clrSchemeMapping w:accent1="accent1" w:accent2="accent2" w:accent3="accent3" w:accent4="accent4" w:accent5="accent5" w:accent6="accent6" w:bg1="light1" w:bg2="light2" w:followedHyperlink="followedHyperlink" w:hyperlink="hyperlink" w:t1="dark1" w:t2="dark2"/>
+  <w:decimalSymbol w:val="."/>
+  <w:listSeparator w:val=","/>
+</w:settings>
+</file>
+
+<file path=word\styles.xml><?xml version="1.0" encoding="utf-8"?>
 <w:styles xmlns:r="http://schemas.openxmlformats.org/officeDocument/2006/relationships" xmlns:w="http://schemas.openxmlformats.org/wordprocessingml/2006/main">
   <w:docDefaults>
     <w:rPrDefault>
@@ -11169,7 +11280,7 @@
 </w:styles>
 </file>
 
-<file path=word/theme/theme1.xml><?xml version="1.0" encoding="utf-8"?>
+<file path=word\theme\theme1.xml><?xml version="1.0" encoding="utf-8"?>
 <a:theme xmlns:a="http://schemas.openxmlformats.org/drawingml/2006/main" name="Office Theme">
   <a:themeElements>
     <a:clrScheme name="Office">
@@ -11462,4 +11573,11 @@
     </a:ext>
   </a:extLst>
 </a:theme>
+</file>
+
+<file path=word\webSettings.xml><?xml version="1.0" encoding="utf-8"?>
+<ns0:webSettings xmlns:ns0="http://schemas.openxmlformats.org/wordprocessingml/2006/main">
+  <ns0:allowPNG/>
+  <ns0:doNotSaveAsSingleFile/>
+</ns0:webSettings>
 </file>
</xml_diff>